<commit_message>
Fix some bugs in dimensions
</commit_message>
<xml_diff>
--- a/spec/fixtures/sample.docx
+++ b/spec/fixtures/sample.docx
@@ -560,7 +560,7 @@
       </w:r>
     </w:p>
     <w:sectPr>
-      <w:pgSz w:w="11906" w:h="15840"/>
+      <w:pgSz w:w="11906" w:h="16838" w:orient="portrait"/>
       <w:pgMar w:bottom="1133" w:footer="708" w:gutter="0" w:header="708" w:left="1133" w:right="1133" w:top="1133"/>
       <w:cols w:space="708"/>
       <w:docGrid w:linePitch="360"/>
@@ -822,7 +822,7 @@
       </w:tr>
     </w:tbl>
     <w:sectPr>
-      <w:pgSz w:w="15840" w:h="11906" w:orient="landscape}"/>
+      <w:pgSz w:w="16838" w:h="11906" w:orient="landscape"/>
       <w:pgMar w:bottom="1133" w:footer="708" w:gutter="0" w:header="708" w:left="1133" w:right="1133" w:top="1133"/>
       <w:cols w:space="708"/>
       <w:docGrid w:linePitch="360"/>

</xml_diff>